<commit_message>
paper: add Appendix A (robustness/falsification battery) and Appendix B (inverse-PINN variants + bifurcation)
Final review of all results folded in: lag-stability/LOO, transform robustness,
kernel placebo (lobe ubiquitous), VAR(p) Lyapunov equivalence, hierarchical pooling,
the four inverse-PINN variants (only Fourier features recover the lag), and the
bifurcation check (no delay-induced Hopf). Both .tex (6pp) and .docx regenerated.

Co-Authored-By: Claude Opus 4.8 (1M context) <noreply@anthropic.com>
</commit_message>
<xml_diff>
--- a/paper/main.docx
+++ b/paper/main.docx
@@ -369,6 +369,804 @@
         <w:pStyle w:val="Heading1"/>
       </w:pPr>
       <w:r>
+        <w:t>Appendix A. Robustness and falsification battery</w:t>
+      </w:r>
+    </w:p>
+    <w:p>
+      <w:r>
+        <w:rPr>
+          <w:b w:val="0"/>
+          <w:i w:val="0"/>
+          <w:sz w:val="22"/>
+        </w:rPr>
+        <w:t>Table A1 collects the auxiliary tests. The location of the lag (≈5 quarters) is stable within the difference family (QoQ, Δlog) and to leave-one-crisis-out (Fig. A1, left; pooled μ≈4.7, span 0.62), though per-crisis CIs are wide because identification emerges only by pooling. The negative lobe is not a clean crisis-specific signature: a kernel placebo finds it roughly as often off-crisis, and a VAR(p≥4) reproduces it from its coefficients (Fig. 3). YoY both inflates the magnitude ~2× and shifts the apparent lag (to ~2 quarters); two-sided cycle filters collapse it to a contemporaneous term — so we report QoQ throughout (Fig. A1, right).</w:t>
+      </w:r>
+    </w:p>
+    <w:tbl>
+      <w:tblPr>
+        <w:tblStyle w:val="LightGrid-Accent1"/>
+        <w:tblW w:type="auto" w:w="0"/>
+        <w:tblLook w:firstColumn="1" w:firstRow="1" w:lastColumn="0" w:lastRow="0" w:noHBand="0" w:noVBand="1" w:val="04A0"/>
+      </w:tblPr>
+      <w:tblGrid>
+        <w:gridCol w:w="2880"/>
+        <w:gridCol w:w="2880"/>
+        <w:gridCol w:w="2880"/>
+      </w:tblGrid>
+      <w:tr>
+        <w:tc>
+          <w:tcPr>
+            <w:tcW w:type="dxa" w:w="2880"/>
+          </w:tcPr>
+          <w:p>
+            <w:r>
+              <w:rPr>
+                <w:b/>
+                <w:sz w:val="18"/>
+              </w:rPr>
+              <w:t>Test</w:t>
+            </w:r>
+          </w:p>
+        </w:tc>
+        <w:tc>
+          <w:tcPr>
+            <w:tcW w:type="dxa" w:w="2880"/>
+          </w:tcPr>
+          <w:p>
+            <w:r>
+              <w:rPr>
+                <w:b/>
+                <w:sz w:val="18"/>
+              </w:rPr>
+              <w:t>Question</w:t>
+            </w:r>
+          </w:p>
+        </w:tc>
+        <w:tc>
+          <w:tcPr>
+            <w:tcW w:type="dxa" w:w="2880"/>
+          </w:tcPr>
+          <w:p>
+            <w:r>
+              <w:rPr>
+                <w:b/>
+                <w:sz w:val="18"/>
+              </w:rPr>
+              <w:t>Result</w:t>
+            </w:r>
+          </w:p>
+        </w:tc>
+      </w:tr>
+      <w:tr>
+        <w:tc>
+          <w:tcPr>
+            <w:tcW w:type="dxa" w:w="2880"/>
+          </w:tcPr>
+          <w:p>
+            <w:r>
+              <w:rPr>
+                <w:sz w:val="18"/>
+              </w:rPr>
+              <w:t>Transform robustness</w:t>
+            </w:r>
+          </w:p>
+        </w:tc>
+        <w:tc>
+          <w:tcPr>
+            <w:tcW w:type="dxa" w:w="2880"/>
+          </w:tcPr>
+          <w:p>
+            <w:r>
+              <w:rPr>
+                <w:sz w:val="18"/>
+              </w:rPr>
+              <w:t>lag robust to transform?</w:t>
+            </w:r>
+          </w:p>
+        </w:tc>
+        <w:tc>
+          <w:tcPr>
+            <w:tcW w:type="dxa" w:w="2880"/>
+          </w:tcPr>
+          <w:p>
+            <w:r>
+              <w:rPr>
+                <w:sz w:val="18"/>
+              </w:rPr>
+              <w:t>μ*≈5q (QoQ/Δlog); YoY→2q; filters→1q</w:t>
+            </w:r>
+          </w:p>
+        </w:tc>
+      </w:tr>
+      <w:tr>
+        <w:tc>
+          <w:tcPr>
+            <w:tcW w:type="dxa" w:w="2880"/>
+          </w:tcPr>
+          <w:p>
+            <w:r>
+              <w:rPr>
+                <w:sz w:val="18"/>
+              </w:rPr>
+              <w:t>Lag stability / LOO</w:t>
+            </w:r>
+          </w:p>
+        </w:tc>
+        <w:tc>
+          <w:tcPr>
+            <w:tcW w:type="dxa" w:w="2880"/>
+          </w:tcPr>
+          <w:p>
+            <w:r>
+              <w:rPr>
+                <w:sz w:val="18"/>
+              </w:rPr>
+              <w:t>lag stable across crises?</w:t>
+            </w:r>
+          </w:p>
+        </w:tc>
+        <w:tc>
+          <w:tcPr>
+            <w:tcW w:type="dxa" w:w="2880"/>
+          </w:tcPr>
+          <w:p>
+            <w:r>
+              <w:rPr>
+                <w:sz w:val="18"/>
+              </w:rPr>
+              <w:t>pooled μ≈4.7q; LOO span 0.62q; all in CI</w:t>
+            </w:r>
+          </w:p>
+        </w:tc>
+      </w:tr>
+      <w:tr>
+        <w:tc>
+          <w:tcPr>
+            <w:tcW w:type="dxa" w:w="2880"/>
+          </w:tcPr>
+          <w:p>
+            <w:r>
+              <w:rPr>
+                <w:sz w:val="18"/>
+              </w:rPr>
+              <w:t>Hierarchical pooling</w:t>
+            </w:r>
+          </w:p>
+        </w:tc>
+        <w:tc>
+          <w:tcPr>
+            <w:tcW w:type="dxa" w:w="2880"/>
+          </w:tcPr>
+          <w:p>
+            <w:r>
+              <w:rPr>
+                <w:sz w:val="18"/>
+              </w:rPr>
+              <w:t>population lag &amp; spread</w:t>
+            </w:r>
+          </w:p>
+        </w:tc>
+        <w:tc>
+          <w:tcPr>
+            <w:tcW w:type="dxa" w:w="2880"/>
+          </w:tcPr>
+          <w:p>
+            <w:r>
+              <w:rPr>
+                <w:sz w:val="18"/>
+              </w:rPr>
+              <w:t>μ_pop≈4.9q [4.4,5.5]; spread contested</w:t>
+            </w:r>
+          </w:p>
+        </w:tc>
+      </w:tr>
+      <w:tr>
+        <w:tc>
+          <w:tcPr>
+            <w:tcW w:type="dxa" w:w="2880"/>
+          </w:tcPr>
+          <w:p>
+            <w:r>
+              <w:rPr>
+                <w:sz w:val="18"/>
+              </w:rPr>
+              <w:t>Kernel placebo</w:t>
+            </w:r>
+          </w:p>
+        </w:tc>
+        <w:tc>
+          <w:tcPr>
+            <w:tcW w:type="dxa" w:w="2880"/>
+          </w:tcPr>
+          <w:p>
+            <w:r>
+              <w:rPr>
+                <w:sz w:val="18"/>
+              </w:rPr>
+              <w:t>is the 4–5q lobe crisis-specific?</w:t>
+            </w:r>
+          </w:p>
+        </w:tc>
+        <w:tc>
+          <w:tcPr>
+            <w:tcW w:type="dxa" w:w="2880"/>
+          </w:tcPr>
+          <w:p>
+            <w:r>
+              <w:rPr>
+                <w:sz w:val="18"/>
+              </w:rPr>
+              <w:t>ubiquitous (appears off-crisis too)</w:t>
+            </w:r>
+          </w:p>
+        </w:tc>
+      </w:tr>
+      <w:tr>
+        <w:tc>
+          <w:tcPr>
+            <w:tcW w:type="dxa" w:w="2880"/>
+          </w:tcPr>
+          <w:p>
+            <w:r>
+              <w:rPr>
+                <w:sz w:val="18"/>
+              </w:rPr>
+              <w:t>VAR(p) Lyapunov</w:t>
+            </w:r>
+          </w:p>
+        </w:tc>
+        <w:tc>
+          <w:tcPr>
+            <w:tcW w:type="dxa" w:w="2880"/>
+          </w:tcPr>
+          <w:p>
+            <w:r>
+              <w:rPr>
+                <w:sz w:val="18"/>
+              </w:rPr>
+              <w:t>does a linear VAR reproduce it?</w:t>
+            </w:r>
+          </w:p>
+        </w:tc>
+        <w:tc>
+          <w:tcPr>
+            <w:tcW w:type="dxa" w:w="2880"/>
+          </w:tcPr>
+          <w:p>
+            <w:r>
+              <w:rPr>
+                <w:sz w:val="18"/>
+              </w:rPr>
+              <w:t>yes for p≥4 ⇒ obs. equivalence</w:t>
+            </w:r>
+          </w:p>
+        </w:tc>
+      </w:tr>
+      <w:tr>
+        <w:tc>
+          <w:tcPr>
+            <w:tcW w:type="dxa" w:w="2880"/>
+          </w:tcPr>
+          <w:p>
+            <w:r>
+              <w:rPr>
+                <w:sz w:val="18"/>
+              </w:rPr>
+              <w:t>Pooled-dynamics placebo</w:t>
+            </w:r>
+          </w:p>
+        </w:tc>
+        <w:tc>
+          <w:tcPr>
+            <w:tcW w:type="dxa" w:w="2880"/>
+          </w:tcPr>
+          <w:p>
+            <w:r>
+              <w:rPr>
+                <w:sz w:val="18"/>
+              </w:rPr>
+              <w:t>is shared crisis dynamics special?</w:t>
+            </w:r>
+          </w:p>
+        </w:tc>
+        <w:tc>
+          <w:tcPr>
+            <w:tcW w:type="dxa" w:w="2880"/>
+          </w:tcPr>
+          <w:p>
+            <w:r>
+              <w:rPr>
+                <w:sz w:val="18"/>
+              </w:rPr>
+              <w:t>preliminary: ratios ≈ crisis ⇒ not special</w:t>
+            </w:r>
+          </w:p>
+        </w:tc>
+      </w:tr>
+    </w:tbl>
+    <w:p>
+      <w:r>
+        <w:rPr>
+          <w:b w:val="0"/>
+          <w:i/>
+          <w:sz w:val="18"/>
+        </w:rPr>
+        <w:t>Table A1. Auxiliary robustness and falsification tests.</w:t>
+      </w:r>
+    </w:p>
+    <w:p>
+      <w:pPr>
+        <w:jc w:val="center"/>
+      </w:pPr>
+      <w:r>
+        <w:drawing>
+          <wp:inline xmlns:a="http://schemas.openxmlformats.org/drawingml/2006/main" xmlns:pic="http://schemas.openxmlformats.org/drawingml/2006/picture">
+            <wp:extent cx="4572000" cy="2442909"/>
+            <wp:docPr id="4" name="Picture 4"/>
+            <wp:cNvGraphicFramePr>
+              <a:graphicFrameLocks noChangeAspect="1"/>
+            </wp:cNvGraphicFramePr>
+            <a:graphic>
+              <a:graphicData uri="http://schemas.openxmlformats.org/drawingml/2006/picture">
+                <pic:pic>
+                  <pic:nvPicPr>
+                    <pic:cNvPr id="0" name="p12_lag_stability.png"/>
+                    <pic:cNvPicPr/>
+                  </pic:nvPicPr>
+                  <pic:blipFill>
+                    <a:blip r:embed="rId12"/>
+                    <a:stretch>
+                      <a:fillRect/>
+                    </a:stretch>
+                  </pic:blipFill>
+                  <pic:spPr>
+                    <a:xfrm>
+                      <a:off x="0" y="0"/>
+                      <a:ext cx="4572000" cy="2442909"/>
+                    </a:xfrm>
+                    <a:prstGeom prst="rect"/>
+                  </pic:spPr>
+                </pic:pic>
+              </a:graphicData>
+            </a:graphic>
+          </wp:inline>
+        </w:drawing>
+      </w:r>
+    </w:p>
+    <w:p>
+      <w:pPr>
+        <w:jc w:val="center"/>
+      </w:pPr>
+      <w:r>
+        <w:rPr>
+          <w:i/>
+          <w:sz w:val="18"/>
+        </w:rPr>
+        <w:t>Figure A1a. Per-crisis maturation lag with leave-one-crisis-out: the pooled lag does not depend on any single episode.</w:t>
+      </w:r>
+    </w:p>
+    <w:p>
+      <w:pPr>
+        <w:jc w:val="center"/>
+      </w:pPr>
+      <w:r>
+        <w:drawing>
+          <wp:inline xmlns:a="http://schemas.openxmlformats.org/drawingml/2006/main" xmlns:pic="http://schemas.openxmlformats.org/drawingml/2006/picture">
+            <wp:extent cx="4572000" cy="1676400"/>
+            <wp:docPr id="5" name="Picture 5"/>
+            <wp:cNvGraphicFramePr>
+              <a:graphicFrameLocks noChangeAspect="1"/>
+            </wp:cNvGraphicFramePr>
+            <a:graphic>
+              <a:graphicData uri="http://schemas.openxmlformats.org/drawingml/2006/picture">
+                <pic:pic>
+                  <pic:nvPicPr>
+                    <pic:cNvPr id="0" name="p12_transform_robustness.png"/>
+                    <pic:cNvPicPr/>
+                  </pic:nvPicPr>
+                  <pic:blipFill>
+                    <a:blip r:embed="rId13"/>
+                    <a:stretch>
+                      <a:fillRect/>
+                    </a:stretch>
+                  </pic:blipFill>
+                  <pic:spPr>
+                    <a:xfrm>
+                      <a:off x="0" y="0"/>
+                      <a:ext cx="4572000" cy="1676400"/>
+                    </a:xfrm>
+                    <a:prstGeom prst="rect"/>
+                  </pic:spPr>
+                </pic:pic>
+              </a:graphicData>
+            </a:graphic>
+          </wp:inline>
+        </w:drawing>
+      </w:r>
+    </w:p>
+    <w:p>
+      <w:pPr>
+        <w:jc w:val="center"/>
+      </w:pPr>
+      <w:r>
+        <w:rPr>
+          <w:i/>
+          <w:sz w:val="18"/>
+        </w:rPr>
+        <w:t>Figure A1b. Estimated lag location under different transforms: stable within the difference family; shifted by YoY and by two-sided cycle filters.</w:t>
+      </w:r>
+    </w:p>
+    <w:p>
+      <w:pPr>
+        <w:pStyle w:val="Heading1"/>
+      </w:pPr>
+      <w:r>
+        <w:t>Appendix B. Inverse-PINN variants and a stability check</w:t>
+      </w:r>
+    </w:p>
+    <w:p>
+      <w:r>
+        <w:rPr>
+          <w:b w:val="0"/>
+          <w:i w:val="0"/>
+          <w:sz w:val="22"/>
+        </w:rPr>
+        <w:t>The maturation lag is recoverable by the differentiable inverse only when the surrogate network can represent the series and the parameters are well-posed (Table B1). A plain network on the long window suffers spectral bias and the lag collapses; per-crisis pooling fixes the fit (R²=0.86) but not the lag; only Fourier-feature inputs recover the lag cleanly (8.9% synthetic error, 0.98 years real). A bifurcation analysis of the calibrated system (Fig. B1) finds no delay-induced Hopf instability: the instability comes from low damping, not the lag, and the structural fit disagrees with the distributed-lag estimate on μ. We therefore do not advance an 'endogenous delayed-feedback instability' claim — it would require the stronger identification a panel or micro gestation data could provide.</w:t>
+      </w:r>
+    </w:p>
+    <w:tbl>
+      <w:tblPr>
+        <w:tblStyle w:val="LightGrid-Accent1"/>
+        <w:tblW w:type="auto" w:w="0"/>
+        <w:tblLook w:firstColumn="1" w:firstRow="1" w:lastColumn="0" w:lastRow="0" w:noHBand="0" w:noVBand="1" w:val="04A0"/>
+      </w:tblPr>
+      <w:tblGrid>
+        <w:gridCol w:w="2160"/>
+        <w:gridCol w:w="2160"/>
+        <w:gridCol w:w="2160"/>
+        <w:gridCol w:w="2160"/>
+      </w:tblGrid>
+      <w:tr>
+        <w:tc>
+          <w:tcPr>
+            <w:tcW w:type="dxa" w:w="2160"/>
+          </w:tcPr>
+          <w:p>
+            <w:r>
+              <w:rPr>
+                <w:b/>
+                <w:sz w:val="18"/>
+              </w:rPr>
+              <w:t>Variant</w:t>
+            </w:r>
+          </w:p>
+        </w:tc>
+        <w:tc>
+          <w:tcPr>
+            <w:tcW w:type="dxa" w:w="2160"/>
+          </w:tcPr>
+          <w:p>
+            <w:r>
+              <w:rPr>
+                <w:b/>
+                <w:sz w:val="18"/>
+              </w:rPr>
+              <w:t>Synthetic (true 4q)</w:t>
+            </w:r>
+          </w:p>
+        </w:tc>
+        <w:tc>
+          <w:tcPr>
+            <w:tcW w:type="dxa" w:w="2160"/>
+          </w:tcPr>
+          <w:p>
+            <w:r>
+              <w:rPr>
+                <w:b/>
+                <w:sz w:val="18"/>
+              </w:rPr>
+              <w:t>Real lag</w:t>
+            </w:r>
+          </w:p>
+        </w:tc>
+        <w:tc>
+          <w:tcPr>
+            <w:tcW w:type="dxa" w:w="2160"/>
+          </w:tcPr>
+          <w:p>
+            <w:r>
+              <w:rPr>
+                <w:b/>
+                <w:sz w:val="18"/>
+              </w:rPr>
+              <w:t>Verdict</w:t>
+            </w:r>
+          </w:p>
+        </w:tc>
+      </w:tr>
+      <w:tr>
+        <w:tc>
+          <w:tcPr>
+            <w:tcW w:type="dxa" w:w="2160"/>
+          </w:tcPr>
+          <w:p>
+            <w:r>
+              <w:rPr>
+                <w:sz w:val="18"/>
+              </w:rPr>
+              <w:t>Single-shooting / convolution</w:t>
+            </w:r>
+          </w:p>
+        </w:tc>
+        <w:tc>
+          <w:tcPr>
+            <w:tcW w:type="dxa" w:w="2160"/>
+          </w:tcPr>
+          <w:p>
+            <w:r>
+              <w:rPr>
+                <w:sz w:val="18"/>
+              </w:rPr>
+              <w:t>1.86q (54% err)</w:t>
+            </w:r>
+          </w:p>
+        </w:tc>
+        <w:tc>
+          <w:tcPr>
+            <w:tcW w:type="dxa" w:w="2160"/>
+          </w:tcPr>
+          <w:p>
+            <w:r>
+              <w:rPr>
+                <w:sz w:val="18"/>
+              </w:rPr>
+              <w:t>collapses to 0.23q, non-physical</w:t>
+            </w:r>
+          </w:p>
+        </w:tc>
+        <w:tc>
+          <w:tcPr>
+            <w:tcW w:type="dxa" w:w="2160"/>
+          </w:tcPr>
+          <w:p>
+            <w:r>
+              <w:rPr>
+                <w:sz w:val="18"/>
+              </w:rPr>
+              <w:t>fails</w:t>
+            </w:r>
+          </w:p>
+        </w:tc>
+      </w:tr>
+      <w:tr>
+        <w:tc>
+          <w:tcPr>
+            <w:tcW w:type="dxa" w:w="2160"/>
+          </w:tcPr>
+          <w:p>
+            <w:r>
+              <w:rPr>
+                <w:sz w:val="18"/>
+              </w:rPr>
+              <w:t>Per-crisis pooled</w:t>
+            </w:r>
+          </w:p>
+        </w:tc>
+        <w:tc>
+          <w:tcPr>
+            <w:tcW w:type="dxa" w:w="2160"/>
+          </w:tcPr>
+          <w:p>
+            <w:r>
+              <w:rPr>
+                <w:sz w:val="18"/>
+              </w:rPr>
+              <w:t>1.64q (59% err)</w:t>
+            </w:r>
+          </w:p>
+        </w:tc>
+        <w:tc>
+          <w:tcPr>
+            <w:tcW w:type="dxa" w:w="2160"/>
+          </w:tcPr>
+          <w:p>
+            <w:r>
+              <w:rPr>
+                <w:sz w:val="18"/>
+              </w:rPr>
+              <w:t>0.84q (R²=0.86)</w:t>
+            </w:r>
+          </w:p>
+        </w:tc>
+        <w:tc>
+          <w:tcPr>
+            <w:tcW w:type="dxa" w:w="2160"/>
+          </w:tcPr>
+          <w:p>
+            <w:r>
+              <w:rPr>
+                <w:sz w:val="18"/>
+              </w:rPr>
+              <w:t>fits, lag collapses</w:t>
+            </w:r>
+          </w:p>
+        </w:tc>
+      </w:tr>
+      <w:tr>
+        <w:tc>
+          <w:tcPr>
+            <w:tcW w:type="dxa" w:w="2160"/>
+          </w:tcPr>
+          <w:p>
+            <w:r>
+              <w:rPr>
+                <w:sz w:val="18"/>
+              </w:rPr>
+              <w:t>Profile-likelihood in μ</w:t>
+            </w:r>
+          </w:p>
+        </w:tc>
+        <w:tc>
+          <w:tcPr>
+            <w:tcW w:type="dxa" w:w="2160"/>
+          </w:tcPr>
+          <w:p>
+            <w:r>
+              <w:rPr>
+                <w:sz w:val="18"/>
+              </w:rPr>
+              <w:t>—</w:t>
+            </w:r>
+          </w:p>
+        </w:tc>
+        <w:tc>
+          <w:tcPr>
+            <w:tcW w:type="dxa" w:w="2160"/>
+          </w:tcPr>
+          <w:p>
+            <w:r>
+              <w:rPr>
+                <w:sz w:val="18"/>
+              </w:rPr>
+              <w:t>inconclusive</w:t>
+            </w:r>
+          </w:p>
+        </w:tc>
+        <w:tc>
+          <w:tcPr>
+            <w:tcW w:type="dxa" w:w="2160"/>
+          </w:tcPr>
+          <w:p>
+            <w:r>
+              <w:rPr>
+                <w:sz w:val="18"/>
+              </w:rPr>
+              <w:t>unstable</w:t>
+            </w:r>
+          </w:p>
+        </w:tc>
+      </w:tr>
+      <w:tr>
+        <w:tc>
+          <w:tcPr>
+            <w:tcW w:type="dxa" w:w="2160"/>
+          </w:tcPr>
+          <w:p>
+            <w:r>
+              <w:rPr>
+                <w:sz w:val="18"/>
+              </w:rPr>
+              <w:t>Fourier features</w:t>
+            </w:r>
+          </w:p>
+        </w:tc>
+        <w:tc>
+          <w:tcPr>
+            <w:tcW w:type="dxa" w:w="2160"/>
+          </w:tcPr>
+          <w:p>
+            <w:r>
+              <w:rPr>
+                <w:sz w:val="18"/>
+              </w:rPr>
+              <w:t>4.36q (8.9%)</w:t>
+            </w:r>
+          </w:p>
+        </w:tc>
+        <w:tc>
+          <w:tcPr>
+            <w:tcW w:type="dxa" w:w="2160"/>
+          </w:tcPr>
+          <w:p>
+            <w:r>
+              <w:rPr>
+                <w:sz w:val="18"/>
+              </w:rPr>
+              <w:t>3.90q = 0.98yr (R²=1)</w:t>
+            </w:r>
+          </w:p>
+        </w:tc>
+        <w:tc>
+          <w:tcPr>
+            <w:tcW w:type="dxa" w:w="2160"/>
+          </w:tcPr>
+          <w:p>
+            <w:r>
+              <w:rPr>
+                <w:sz w:val="18"/>
+              </w:rPr>
+              <w:t>recovers</w:t>
+            </w:r>
+          </w:p>
+        </w:tc>
+      </w:tr>
+    </w:tbl>
+    <w:p>
+      <w:r>
+        <w:rPr>
+          <w:b w:val="0"/>
+          <w:i/>
+          <w:sz w:val="18"/>
+        </w:rPr>
+        <w:t>Table B1. Inverse-PINN variants; only Fourier-feature inputs both fit and recover the lag.</w:t>
+      </w:r>
+    </w:p>
+    <w:p>
+      <w:pPr>
+        <w:jc w:val="center"/>
+      </w:pPr>
+      <w:r>
+        <w:drawing>
+          <wp:inline xmlns:a="http://schemas.openxmlformats.org/drawingml/2006/main" xmlns:pic="http://schemas.openxmlformats.org/drawingml/2006/picture">
+            <wp:extent cx="5120640" cy="1969477"/>
+            <wp:docPr id="6" name="Picture 6"/>
+            <wp:cNvGraphicFramePr>
+              <a:graphicFrameLocks noChangeAspect="1"/>
+            </wp:cNvGraphicFramePr>
+            <a:graphic>
+              <a:graphicData uri="http://schemas.openxmlformats.org/drawingml/2006/picture">
+                <pic:pic>
+                  <pic:nvPicPr>
+                    <pic:cNvPr id="0" name="p13_bifurcation.png"/>
+                    <pic:cNvPicPr/>
+                  </pic:nvPicPr>
+                  <pic:blipFill>
+                    <a:blip r:embed="rId14"/>
+                    <a:stretch>
+                      <a:fillRect/>
+                    </a:stretch>
+                  </pic:blipFill>
+                  <pic:spPr>
+                    <a:xfrm>
+                      <a:off x="0" y="0"/>
+                      <a:ext cx="5120640" cy="1969477"/>
+                    </a:xfrm>
+                    <a:prstGeom prst="rect"/>
+                  </pic:spPr>
+                </pic:pic>
+              </a:graphicData>
+            </a:graphic>
+          </wp:inline>
+        </w:drawing>
+      </w:r>
+    </w:p>
+    <w:p>
+      <w:pPr>
+        <w:jc w:val="center"/>
+      </w:pPr>
+      <w:r>
+        <w:rPr>
+          <w:i/>
+          <w:sz w:val="18"/>
+        </w:rPr>
+        <w:t>Figure B1. Stability of the calibrated maturation system: no delay-induced Hopf (left), and the Hopf boundary in (μ, k) with the estimate marked (right). The mechanistic 'instability' reading is not supported by these data.</w:t>
+      </w:r>
+    </w:p>
+    <w:p>
+      <w:pPr>
+        <w:pStyle w:val="Heading1"/>
+      </w:pPr>
+      <w:r>
         <w:t>References</w:t>
       </w:r>
     </w:p>

</xml_diff>